<commit_message>
Rewrite NLA Eval paper as a full platform, not a first approach.
</commit_message>
<xml_diff>
--- a/research/conaiisi_2026_nla_eval.docx
+++ b/research/conaiisi_2026_nla_eval.docx
@@ -121,7 +121,7 @@
           <w:color w:val="000000"/>
           <w:sz w:val="20"/>
         </w:rPr>
-        <w:t>El presente trabajo busca un primer acercamiento a la evaluación sistemática de verbalizaciones de activación producidas por Natural Language Autoencoders (NLA). Un NLA comprime el vector de activación de un modelo de lenguaje en un texto breve y reconstruye ese vector a partir del texto. Ese texto, llamado Activation Verbalizer (AV), es un señalizador interpretable, no una lectura literal de las creencias del modelo. Las plataformas actuales, en particular Neuronpedia, permiten inspeccionar un chat y un token a la vez. No ofrecen un ciclo de experimento comparable al que LangSmith formalizó para las salidas de aplicaciones con inteligencia artificial. Anthropic ya aplica un LLM como juez sobre AVs en un estudio de awareness de evaluación, pero ese juez vive dentro de un paper, no como herramienta reutilizable sobre NLA públicos. Se propone NLA Eval, un marco y un prototipo que orquesta datasets de prompts, una política de tokens, llamadas a la API de Neuronpedia, evaluadores configurables (léxico y LLM-as-judge) y una vista de comparación de corridas. El objeto evaluado es el AV en una posición de token, no la respuesta pública del modelo. La validación empírica a escala y el acuerdo humano-juez sobre un corpus etiquetado se plantean como trabajo inmediato.</w:t>
+        <w:t>Este trabajo presenta NLA Eval, una plataforma orientada a la evaluación sistemática de verbalizaciones de activación producidas por Natural Language Autoencoders (NLA). Un NLA comprime el vector de activación de un modelo de lenguaje en un texto breve y reconstruye ese vector a partir del texto. Ese texto, llamado Activation Verbalizer (AV), es un señalizador interpretable, no una lectura literal de las creencias del modelo. Neuronpedia permite inspeccionar un chat y un token a la vez, pero no cubre el ciclo completo de experimento sobre NLA públicos. Anthropic aplica un LLM como juez sobre AVs en un estudio de awareness de evaluación, como método interno de un paper, no como herramienta reutilizable. NLA Eval operacionaliza ese ciclo mediante datasets de prompts, una política de tokens, llamadas a la API de Neuronpedia, evaluadores configurables y una vista de comparación de corridas. El objeto evaluado es el AV en una posición de token, no la respuesta pública del modelo. La validación empírica en contextos de investigación y el acuerdo humano-juez sobre un corpus etiquetado constituyen los pasos siguientes para consolidar su impacto.</w:t>
       </w:r>
     </w:p>
     <w:p>
@@ -217,7 +217,7 @@
           <w:color w:val="000000"/>
           <w:sz w:val="24"/>
         </w:rPr>
-        <w:t>Neuronpedia, en colaboración con Anthropic, hostea checkpoints públicos (por ejemplo Llama 3.3 70B con kitft-l53 y Gemma 3 27B con kitft-l41) y una API de completion y explain [2]. El producto es un microscopio. Un prompt, un modelo, una pestaña. Quien investiga un tema (un prior de foro, un riesgo, una awareness de evaluación) termina exportando capturas, eligiendo a mano el último token del usuario y el primero del asistente, y pegando verbalizaciones en otro chat para que un LLM encuentre el patrón. Ese flujo no es un experimento. Es artesanía.</w:t>
+        <w:t>Neuronpedia, en colaboración con Anthropic, hostea checkpoints públicos (por ejemplo Llama 3.3 70B con kitft-l53 y Gemma 3 27B con kitft-l41) y una API de completion y explain [2]. El producto es un microscopio. Un prompt, un modelo, una pestaña. Quien investiga un tema (un prior de foro, un riesgo, una awareness de evaluación) termina exportando capturas, eligiendo a mano el último token del usuario y el primero del asistente, y pegando verbalizaciones en otro chat para que un segundo modelo encuentre el patrón. Ese flujo no es un experimento. Es artesanía.</w:t>
       </w:r>
     </w:p>
     <w:p>
@@ -233,23 +233,7 @@
           <w:color w:val="000000"/>
           <w:sz w:val="24"/>
         </w:rPr>
-        <w:t>En paralelo, el testing de aplicaciones no deterministas con IA ya tiene un marco de producto. LangSmith trata datasets, corridas, evaluadores (código o LLM-as-judge) y gráficos de comparación entre versiones de un flujo [3]. El objeto sigue siendo la salida de la aplicación.</w:t>
-      </w:r>
-    </w:p>
-    <w:p>
-      <w:pPr>
-        <w:spacing w:after="120" w:before="0" w:line="240" w:lineRule="auto"/>
-        <w:jc w:val="both"/>
-      </w:pPr>
-      <w:r>
-        <w:rPr>
-          <w:rFonts w:ascii="Times New Roman" w:hAnsi="Times New Roman" w:cs="Times New Roman" w:eastAsia="Times New Roman"/>
-          <w:b w:val="0"/>
-          <w:i w:val="0"/>
-          <w:color w:val="000000"/>
-          <w:sz w:val="24"/>
-        </w:rPr>
-        <w:t>El presente trabajo propone el análogo para NLA. No se inventa el LLM-as-judge sobre verbalizaciones. Anthropic lo usó para marcar awareness de evaluación no verbalizada, con un grader sobre 50 tokens de respuesta y un 97 % de acuerdo con los autores en 186 ítems [1]. Se cambia el objeto evaluado y se formaliza el ciclo que hoy falta en las herramientas abiertas. El resto del artículo se organiza así. La Sección 2 formula las motivaciones. La Sección 3 resume el modelo conceptual. La Sección 4 describe la arquitectura, que es el aporte central. La Sección 5 describe el prototipo. La Sección 6 diseña la validación. La Sección 7 discute limitaciones. La Sección 8 concluye.</w:t>
+        <w:t>El presente trabajo presenta NLA Eval, una plataforma que cierra ese ciclo sobre NLA públicos. No se inventa el LLM-as-judge sobre verbalizaciones. Anthropic lo usó para marcar awareness de evaluación no verbalizada, con un grader sobre 50 tokens de respuesta y un 97 % de acuerdo con los autores en 186 ítems [1]. Se cambia el objeto evaluado y se materializa el laboratorio que hoy falta. El resto del artículo se organiza así. La Sección 2 formula las motivaciones. La Sección 3 resume el modelo conceptual. La Sección 4 describe la arquitectura. La Sección 5 detalla las funcionalidades de la plataforma. La Sección 6 diseña la validación. La Sección 7 discute limitaciones. La Sección 8 concluye. La Sección 9 sitúa las referencias de diseño que orientaron el recorte funcional.</w:t>
       </w:r>
     </w:p>
     <w:p>
@@ -281,7 +265,7 @@
           <w:color w:val="000000"/>
           <w:sz w:val="24"/>
         </w:rPr>
-        <w:t>Tres tensiones justifican el marco. Primero, el no determinismo. Un test clásico de API afirma que, dado un input, el output es uno. Un NLA, como el LLM que explica, no se presta a esa igualdad. Hace falta una política fija de tokens, un juez con rúbrica, y tasas a lo largo de un dataset, no una captura. Segundo, la escala. El límite de explain de Neuronpedia (del orden de 16 posiciones por pedido y un tope horario) convierte cada comparación Llama frente a Gemma en un trabajo de scripts y JSON. Sin un orquestador, el investigador elige el token interesante en cada corrida y destruye la comparabilidad. Tercero, el vacío de producto. LangSmith no conoce capas, residuos ni MSE. Neuronpedia no conoce datasets, claves de feedback ni gráficos de hit rate. EasyNLA incluye jueces de unicidad o coherencia mientras se entrena un NLA [1]. Ese es otro trabajo. No puntúa hipótesis experimentales sobre AVs ya desplegados.</w:t>
+        <w:t>Tres tensiones justifican la plataforma. Primero, el no determinismo. Un test clásico de API afirma que, dado un input, el output es uno. Un NLA, como el modelo que explica, no se presta a esa igualdad. Hace falta una política fija de tokens, un juez con rúbrica, y tasas a lo largo de un dataset, no una captura. Segundo, la escala. El límite de explain de Neuronpedia (del orden de 16 posiciones por pedido y un tope horario) convierte cada comparación entre fuentes NLA en un trabajo de scripts y JSON. Sin un orquestador, el investigador elige el token interesante en cada corrida y destruye la comparabilidad. Tercero, el vacío de herramienta. Las plataformas de evaluación de aplicaciones con IA operan sobre la salida visible. Neuronpedia no conoce datasets, claves de feedback ni gráficos de hit rate. Los jueces opcionales usados al entrenar un NLA puntúan calidad de entrenamiento (coherencia, unicidad), no hipótesis experimentales sobre AVs ya desplegados [1].</w:t>
       </w:r>
     </w:p>
     <w:p>
@@ -297,7 +281,7 @@
           <w:color w:val="000000"/>
           <w:sz w:val="24"/>
         </w:rPr>
-        <w:t>El motivo, en una frase, es este. Fomentar investigación sobre NLA, no el entrenamiento de NLA nuevos, sistematizando lo que hoy se hace a mano con capturas y un chat.</w:t>
+        <w:t>El motivo es fomentar investigación sobre NLA, no el entrenamiento de NLA nuevos, sistematizando lo que hoy se hace a mano con capturas y un chat.</w:t>
       </w:r>
     </w:p>
     <w:p>
@@ -329,7 +313,7 @@
           <w:color w:val="000000"/>
           <w:sz w:val="24"/>
         </w:rPr>
-        <w:t>El marco distingue cuatro objetos, en analogía deliberada con LangSmith. La Tabla 1 resume el mapeo.</w:t>
+        <w:t>NLA Eval se organiza en torno a cinco objetos. La Tabla 1 resume el recorte.</w:t>
       </w:r>
     </w:p>
     <w:p>
@@ -345,7 +329,7 @@
           <w:color w:val="000000"/>
           <w:sz w:val="20"/>
         </w:rPr>
-        <w:t>Tabla 1. Mapeo de objetos entre LangSmith y NLA Eval.</w:t>
+        <w:t>Tabla 1. Objetos de NLA Eval.</w:t>
       </w:r>
     </w:p>
     <w:tbl>
@@ -375,7 +359,7 @@
                 <w:color w:val="000000"/>
                 <w:sz w:val="18"/>
               </w:rPr>
-              <w:t>LangSmith</w:t>
+              <w:t>Objeto</w:t>
             </w:r>
           </w:p>
         </w:tc>
@@ -394,7 +378,7 @@
                 <w:color w:val="000000"/>
                 <w:sz w:val="18"/>
               </w:rPr>
-              <w:t>NLA Eval</w:t>
+              <w:t>Rol</w:t>
             </w:r>
           </w:p>
         </w:tc>
@@ -414,7 +398,7 @@
                 <w:color w:val="000000"/>
                 <w:sz w:val="16"/>
               </w:rPr>
-              <w:t>Dataset de prompts</w:t>
+              <w:t>Dataset</w:t>
             </w:r>
           </w:p>
         </w:tc>
@@ -432,7 +416,7 @@
                 <w:color w:val="000000"/>
                 <w:sz w:val="16"/>
               </w:rPr>
-              <w:t>Igual. Prompt y, opcional, referencia</w:t>
+              <w:t>Lista de prompts. Referencia opcional para el juez</w:t>
             </w:r>
           </w:p>
         </w:tc>
@@ -452,7 +436,7 @@
                 <w:color w:val="000000"/>
                 <w:sz w:val="16"/>
               </w:rPr>
-              <w:t>Target = aplicación</w:t>
+              <w:t>Política de tokens</w:t>
             </w:r>
           </w:p>
         </w:tc>
@@ -470,7 +454,7 @@
                 <w:color w:val="000000"/>
                 <w:sz w:val="16"/>
               </w:rPr>
-              <w:t>completion + explain bajo política de tokens</w:t>
+              <w:t>Qué posiciones se explican en cada corrida</w:t>
             </w:r>
           </w:p>
         </w:tc>
@@ -490,7 +474,7 @@
                 <w:color w:val="000000"/>
                 <w:sz w:val="16"/>
               </w:rPr>
-              <w:t>Output de texto</w:t>
+              <w:t>Experimento</w:t>
             </w:r>
           </w:p>
         </w:tc>
@@ -508,7 +492,45 @@
                 <w:color w:val="000000"/>
                 <w:sz w:val="16"/>
               </w:rPr>
-              <w:t>Artefacto completion, AVs, mse, token</w:t>
+              <w:t>Corrida sobre un dataset, una fuente y evaluadores</w:t>
+            </w:r>
+          </w:p>
+        </w:tc>
+      </w:tr>
+      <w:tr>
+        <w:tc>
+          <w:tcPr>
+            <w:tcW w:type="dxa" w:w="4535"/>
+          </w:tcPr>
+          <w:p>
+            <w:r/>
+            <w:r>
+              <w:rPr>
+                <w:rFonts w:ascii="Times New Roman" w:hAnsi="Times New Roman" w:cs="Times New Roman" w:eastAsia="Times New Roman"/>
+                <w:b w:val="0"/>
+                <w:i w:val="0"/>
+                <w:color w:val="000000"/>
+                <w:sz w:val="16"/>
+              </w:rPr>
+              <w:t>Artefacto</w:t>
+            </w:r>
+          </w:p>
+        </w:tc>
+        <w:tc>
+          <w:tcPr>
+            <w:tcW w:type="dxa" w:w="4535"/>
+          </w:tcPr>
+          <w:p>
+            <w:r/>
+            <w:r>
+              <w:rPr>
+                <w:rFonts w:ascii="Times New Roman" w:hAnsi="Times New Roman" w:cs="Times New Roman" w:eastAsia="Times New Roman"/>
+                <w:b w:val="0"/>
+                <w:i w:val="0"/>
+                <w:color w:val="000000"/>
+                <w:sz w:val="16"/>
+              </w:rPr>
+              <w:t>completion, AVs, mse y token</w:t>
             </w:r>
           </w:p>
         </w:tc>
@@ -551,44 +573,6 @@
           </w:p>
         </w:tc>
       </w:tr>
-      <w:tr>
-        <w:tc>
-          <w:tcPr>
-            <w:tcW w:type="dxa" w:w="4535"/>
-          </w:tcPr>
-          <w:p>
-            <w:r/>
-            <w:r>
-              <w:rPr>
-                <w:rFonts w:ascii="Times New Roman" w:hAnsi="Times New Roman" w:cs="Times New Roman" w:eastAsia="Times New Roman"/>
-                <w:b w:val="0"/>
-                <w:i w:val="0"/>
-                <w:color w:val="000000"/>
-                <w:sz w:val="16"/>
-              </w:rPr>
-              <w:t>Comparar experimentos</w:t>
-            </w:r>
-          </w:p>
-        </w:tc>
-        <w:tc>
-          <w:tcPr>
-            <w:tcW w:type="dxa" w:w="4535"/>
-          </w:tcPr>
-          <w:p>
-            <w:r/>
-            <w:r>
-              <w:rPr>
-                <w:rFonts w:ascii="Times New Roman" w:hAnsi="Times New Roman" w:cs="Times New Roman" w:eastAsia="Times New Roman"/>
-                <w:b w:val="0"/>
-                <w:i w:val="0"/>
-                <w:color w:val="000000"/>
-                <w:sz w:val="16"/>
-              </w:rPr>
-              <w:t>Dos corridas sobre el mismo dataset</w:t>
-            </w:r>
-          </w:p>
-        </w:tc>
-      </w:tr>
     </w:tbl>
     <w:p>
       <w:pPr>
@@ -603,7 +587,7 @@
           <w:color w:val="000000"/>
           <w:sz w:val="24"/>
         </w:rPr>
-        <w:t>Una política de tokens, por defecto, replica el gesto que ya se usa en el laboratorio. Último token de contenido del mensaje de usuario. Primer token de la respuesta del asistente. El investigador puede elegir una, la otra, o ambas. El MSE actúa como compuerta. Un AV con error alto no se lee como evidencia. Se reporta como verbalización poco reconstruible.</w:t>
+        <w:t>Una política de tokens, por defecto, fija el último token de contenido del mensaje de usuario y el primer token de la respuesta del asistente. El investigador puede elegir una, la otra, o ambas. El MSE actúa como compuerta. Un AV con error alto no se lee como evidencia. Se reporta como verbalización poco reconstruible.</w:t>
       </w:r>
     </w:p>
     <w:p>
@@ -619,7 +603,7 @@
           <w:color w:val="000000"/>
           <w:sz w:val="24"/>
         </w:rPr>
-        <w:t>El juez no puntúa la creencia del modelo. Produce una señal interpretable. Si la rúbrica pide tema de foro o comunidad, un true no prueba que el preentrenamiento sea Reddit. Apoya una hipótesis que el output solo no mostraba, a validar con más tests [1].</w:t>
+        <w:t>El juez no puntúa la creencia del modelo. Produce una señal interpretable. Si la rúbrica pide tema de foro o comunidad, un true no prueba un origen de corpus. Apoya una hipótesis que el output solo no mostraba, a validar con más tests [1].</w:t>
       </w:r>
     </w:p>
     <w:p>
@@ -651,7 +635,7 @@
           <w:color w:val="000000"/>
           <w:sz w:val="24"/>
         </w:rPr>
-        <w:t>Léxico o código. Subcadena (reddit, forum). Barato y honesto. No captura tema. LLM-as-judge, sin referencia. Rúbrica Mustache sobre el AV. Boolean, score o categoría, más un campo opcional de razonamiento. Omisión, específico de NLA. El tema está en el AV y no en la completion. Es el análogo del awareness verbalizado frente al medido por NLA en [1]. LangSmith no tiene este tipo como objeto de primer orden. Un evaluador pairwise (cuál de dos AVs se prefiere) queda especificado en el diseño y no es el núcleo del prototipo actual.</w:t>
+        <w:t>Léxico o código. Subcadena. Barato y honesto. No captura tema. LLM-as-judge, sin referencia. Rúbrica Mustache sobre el AV. Boolean, score o categoría, más un campo opcional de razonamiento. Omisión, específico de NLA. El tema está en el AV y no en la completion. Es el análogo del awareness verbalizado frente al medido por NLA en [1]. Un evaluador pairwise (cuál de dos AVs se prefiere) forma parte del diseño y se implementa como extensión del núcleo.</w:t>
       </w:r>
     </w:p>
     <w:p>
@@ -683,7 +667,7 @@
           <w:color w:val="000000"/>
           <w:sz w:val="24"/>
         </w:rPr>
-        <w:t>NLA Eval no entrena NLA. Orquesta APIs. La Figura 1 describe el ciclo de una fila. El dataset aporta el example (input). El run produce la completion y las verbalizaciones en las posiciones elegidas. El evaluador consume input, AV de entrada, AV de salida y, si hace falta, la completion, y calcula métricas.</w:t>
+        <w:t>NLA Eval no entrena NLA. Orquesta APIs. La Figura 1 describe el ciclo de una fila. El dataset aporta el example. El run produce la completion y las verbalizaciones en las posiciones elegidas. El evaluador consume input, AV de entrada, AV de salida y, si hace falta, la completion, y calcula métricas.</w:t>
       </w:r>
     </w:p>
     <w:p>
@@ -699,7 +683,7 @@
           <w:color w:val="000000"/>
           <w:sz w:val="20"/>
         </w:rPr>
-        <w:t>Figura 1. El evaluador compara el ejemplo del dataset con las verbalizaciones NLA del token de entrada y del token de salida, no solo input contra output de la aplicación.</w:t>
+        <w:t>Figura 1. El evaluador compara el ejemplo del dataset con las verbalizaciones NLA del token de entrada y del token de salida.</w:t>
       </w:r>
     </w:p>
     <w:tbl>
@@ -938,7 +922,7 @@
                 <w:color w:val="000000"/>
                 <w:sz w:val="16"/>
               </w:rPr>
-              <w:t>Métricas sobre AVs (y omisión vs completion)</w:t>
+              <w:t>Métricas sobre AVs (y omisión frente a completion)</w:t>
             </w:r>
           </w:p>
         </w:tc>
@@ -957,7 +941,7 @@
           <w:color w:val="000000"/>
           <w:sz w:val="24"/>
         </w:rPr>
-        <w:t>La Figura 2 muestra el uso que motiva el marco. Dos configuraciones (v1 y v2) recorren el mismo dataset. El panel de evaluadores resume tasas (por ejemplo hit rate de un juez booleano) para decidir si un modelo más barato o una política de tokens distinta cambia el señalizador interno.</w:t>
+        <w:t>La Figura 2 muestra el uso que organiza la plataforma. Dos configuraciones recorren el mismo dataset. Los evaluadores agregan tasas por experimento.</w:t>
       </w:r>
     </w:p>
     <w:p>
@@ -973,7 +957,7 @@
           <w:color w:val="000000"/>
           <w:sz w:val="20"/>
         </w:rPr>
-        <w:t>Figura 2. Varias versiones de aplicación NLA (modelo, capa, política de tokens) sobre un único dataset. Los evaluadores agregan métricas por experimento.</w:t>
+        <w:t>Figura 2. Varias versiones (modelo, capa, política de tokens) sobre un único dataset. Los evaluadores agregan métricas por experimento.</w:t>
       </w:r>
     </w:p>
     <w:tbl>
@@ -1193,7 +1177,7 @@
           <w:color w:val="000000"/>
           <w:sz w:val="24"/>
         </w:rPr>
-        <w:t>4.1 Interfaz</w:t>
+        <w:t>4.1 Interfaz de entrada y salida</w:t>
       </w:r>
     </w:p>
     <w:p>
@@ -1209,7 +1193,7 @@
           <w:color w:val="000000"/>
           <w:sz w:val="24"/>
         </w:rPr>
-        <w:t>La interfaz es un laboratorio web. Home de onboarding. Datasets. Evaluadores con configuración de feedback alineada a LangSmith (boolean, score, categórica, include reasoning). Corrida de experimento (fuente NLA, política, jueces). Tabla de filas con celdas coloreadas (cumple o no cumple, score, categoría) y gráficos de comparación. Las claves de OpenAI y Neuronpedia viajan en la sesión del navegador hacia un proxy. No se persisten en el cliente como secretos de producto.</w:t>
+        <w:t>La interfaz es el punto de interacción entre el investigador y NLA Eval. Por ella ingresan datasets, rúbricas y claves de API hacia un proxy. En sentido inverso, devuelve filas de experimento, celdas de feedback y gráficos, de modo que la plataforma apoye el análisis sin pretender que el AV reemplace el juicio sobre el instrumento.</w:t>
       </w:r>
     </w:p>
     <w:p>
@@ -1241,7 +1225,7 @@
           <w:color w:val="000000"/>
           <w:sz w:val="24"/>
         </w:rPr>
-        <w:t>El orquestador es el análogo del kernel de ARIA [4], con un trabajo más estrecho. No clasifica requerimientos. Secuencia, por cada ejemplo del dataset, tres pasos. Primero, POST a la API de completion de Neuronpedia, con modelo e identificador de NLA (kitft-l53, kitft-l41). Segundo, selección de posiciones según la política y POST de explain. Tercero, para cada evaluador, un LLM u operación de código sobre el artefacto. El esquema JSON de salida lo dictan las claves de feedback.</w:t>
+        <w:t>El orquestador coordina el ciclo de cada ejemplo desde su ingreso hasta la persistencia de la fila. No ejecuta el NLA. Enruta tres pasos. POST de completion en Neuronpedia, con modelo e identificador de NLA. Selección de posiciones según la política y POST de explain. Para cada evaluador, un LLM u operación de código sobre el artefacto. El esquema JSON de salida lo dictan las claves de feedback.</w:t>
       </w:r>
     </w:p>
     <w:p>
@@ -1257,7 +1241,7 @@
           <w:color w:val="000000"/>
           <w:sz w:val="24"/>
         </w:rPr>
-        <w:t>El orquestador persiste el experimento (filas, scores, comentarios, MSE) para que un GET posterior, en otro proceso, no pierda la corrida. En servidor local el almacén es un JSON. En despliegue el almacén debe ser compartido (por ejemplo Postgres). El filesystem efímero de una función serverless no es un laboratorio.</w:t>
+        <w:t>El orquestador conserva resultados intermedios. Un GET posterior, en otro proceso, no pierde la corrida. En servidor local el almacén es un JSON. En despliegue el almacén es compartido. El filesystem efímero de una función serverless no es un laboratorio.</w:t>
       </w:r>
     </w:p>
     <w:p>
@@ -1289,7 +1273,7 @@
           <w:color w:val="000000"/>
           <w:sz w:val="24"/>
         </w:rPr>
-        <w:t>Esta capa es un cliente. No reimplementa el autoencoder. Encapsula rate limits y el recorte de posiciones. Si explain falla, la fila queda con error y no se inventa un AV. El prototipo usa Llama 3.3 70B Instruct más Gemma 3 27B como contraste, no como par equivalente de claim científico.</w:t>
+        <w:t>Esta capa es un cliente. No reimplementa el autoencoder. Encapsula rate limits y el recorte de posiciones. Si explain falla, la fila queda con error y no se inventa un AV. Las fuentes previstas son Llama 3.3 70B Instruct con kitft-l53 y Gemma 3 27B Instruct con kitft-l41 como contraste, no como par equivalente de claim científico.</w:t>
       </w:r>
     </w:p>
     <w:p>
@@ -1353,7 +1337,7 @@
           <w:color w:val="000000"/>
           <w:sz w:val="24"/>
         </w:rPr>
-        <w:t>La tabla de un run copia el gesto de LangSmith. Columnas de input, referencia, output (el AV) y una columna por clave de feedback. Boolean se muestra como 1.00 o 0.00 con color. Score se colorea entre mínimo y máximo. Categórica muestra el nombre. El encabezado informa el promedio. La comparación de dos experimentos reusa las mismas claves sobre el mismo dataset. Un evaluador pairwise (Figura 3) queda como extensión. Dos AVs del mismo example, un juez de preferencia, preferred en {0, 1}.</w:t>
+        <w:t>La tabla de un run expone input, referencia, output (el AV) y una columna por clave de feedback. Boolean se muestra como 1.00 o 0.00 con color. Score se colorea entre mínimo y máximo. Categórica muestra el nombre. El encabezado informa el promedio. La comparación de dos experimentos reusa las mismas claves sobre el mismo dataset. El evaluador pairwise (Figura 3) opera sobre dos AVs del mismo example.</w:t>
       </w:r>
     </w:p>
     <w:p>
@@ -1369,7 +1353,7 @@
           <w:color w:val="000000"/>
           <w:sz w:val="20"/>
         </w:rPr>
-        <w:t>Figura 3. Evaluación pairwise (diseñada, no núcleo del prototipo). El juez elige entre dos verbalizaciones del mismo example.</w:t>
+        <w:t>Figura 3. Evaluación pairwise. El juez elige entre dos verbalizaciones del mismo example (preferred en 0 o 1).</w:t>
       </w:r>
     </w:p>
     <w:tbl>
@@ -1551,7 +1535,7 @@
           <w:color w:val="000000"/>
           <w:sz w:val="24"/>
         </w:rPr>
-        <w:t>5. Prototipo</w:t>
+        <w:t>5. Funcionalidades de NLA Eval</w:t>
       </w:r>
     </w:p>
     <w:p>
@@ -1567,7 +1551,23 @@
           <w:color w:val="000000"/>
           <w:sz w:val="24"/>
         </w:rPr>
-        <w:t>Se materializó un prototipo web (Next.js) que implementa el ciclo de las Secciones 4.1 a 4.5 contra la API real de Neuronpedia y un juez OpenAI. El prototipo no es la contribución teórica. Es la prueba de que el marco cabe en un frontend más dos llamadas, como se anticipaba. Dataset semilla de prompts de consejo y how-to, juez de tema foro o comunidad, política de último token de usuario, tabla de filas y gráficos de hit rate y MSE medio.</w:t>
+        <w:t>NLA Eval se operacionaliza a través de una plataforma web que aplica política de tokens, evaluación y comparación en un entorno integrado. Su propuesta central no es almacenar chats, sino curar corridas, puntuar AVs y contrastar experimentos. Las funcionalidades siguientes cubren el ciclo completo que el módulo debe ejecutar.</w:t>
+      </w:r>
+    </w:p>
+    <w:p>
+      <w:pPr>
+        <w:spacing w:after="120" w:before="200" w:line="240" w:lineRule="auto"/>
+        <w:jc w:val="left"/>
+      </w:pPr>
+      <w:r>
+        <w:rPr>
+          <w:rFonts w:ascii="Times New Roman" w:hAnsi="Times New Roman" w:cs="Times New Roman" w:eastAsia="Times New Roman"/>
+          <w:b/>
+          <w:i w:val="0"/>
+          <w:color w:val="000000"/>
+          <w:sz w:val="24"/>
+        </w:rPr>
+        <w:t>5.1 Laboratorio y onboarding</w:t>
       </w:r>
     </w:p>
     <w:p>
@@ -1583,7 +1583,167 @@
           <w:color w:val="000000"/>
           <w:sz w:val="24"/>
         </w:rPr>
-        <w:t>No se reportan aquí tasas como hallazgo. Un prototipo de pocos días no sustituye un protocolo de validación. Sí muestra que el cuello de botella deja de ser cómo pego diez capturas y pasa a ser qué rúbrica y qué política de tokens son honestas.</w:t>
+        <w:t>La pantalla inicial describe el flujo. Claves de API, dataset, evaluador, corrida, comparación. El investigador ve de entrada qué objeto se puntúa (el AV) y qué no (la creencia del modelo).</w:t>
+      </w:r>
+    </w:p>
+    <w:p>
+      <w:pPr>
+        <w:spacing w:after="120" w:before="200" w:line="240" w:lineRule="auto"/>
+        <w:jc w:val="left"/>
+      </w:pPr>
+      <w:r>
+        <w:rPr>
+          <w:rFonts w:ascii="Times New Roman" w:hAnsi="Times New Roman" w:cs="Times New Roman" w:eastAsia="Times New Roman"/>
+          <w:b/>
+          <w:i w:val="0"/>
+          <w:color w:val="000000"/>
+          <w:sz w:val="24"/>
+        </w:rPr>
+        <w:t>5.2 Datasets</w:t>
+      </w:r>
+    </w:p>
+    <w:p>
+      <w:pPr>
+        <w:spacing w:after="120" w:before="0" w:line="240" w:lineRule="auto"/>
+        <w:jc w:val="both"/>
+      </w:pPr>
+      <w:r>
+        <w:rPr>
+          <w:rFonts w:ascii="Times New Roman" w:hAnsi="Times New Roman" w:cs="Times New Roman" w:eastAsia="Times New Roman"/>
+          <w:b w:val="0"/>
+          <w:i w:val="0"/>
+          <w:color w:val="000000"/>
+          <w:sz w:val="24"/>
+        </w:rPr>
+        <w:t>El módulo de datasets concentra la lista de prompts con identificador, texto y referencia opcional. Permite alta de ejemplos, edición y selección del conjunto sobre el que se dispara un experimento. Desde aquí se inicia la corrida y se accede a los runs ya persistidos.</w:t>
+      </w:r>
+    </w:p>
+    <w:p>
+      <w:pPr>
+        <w:spacing w:after="120" w:before="200" w:line="240" w:lineRule="auto"/>
+        <w:jc w:val="left"/>
+      </w:pPr>
+      <w:r>
+        <w:rPr>
+          <w:rFonts w:ascii="Times New Roman" w:hAnsi="Times New Roman" w:cs="Times New Roman" w:eastAsia="Times New Roman"/>
+          <w:b/>
+          <w:i w:val="0"/>
+          <w:color w:val="000000"/>
+          <w:sz w:val="24"/>
+        </w:rPr>
+        <w:t>5.3 Evaluadores</w:t>
+      </w:r>
+    </w:p>
+    <w:p>
+      <w:pPr>
+        <w:spacing w:after="120" w:before="0" w:line="240" w:lineRule="auto"/>
+        <w:jc w:val="both"/>
+      </w:pPr>
+      <w:r>
+        <w:rPr>
+          <w:rFonts w:ascii="Times New Roman" w:hAnsi="Times New Roman" w:cs="Times New Roman" w:eastAsia="Times New Roman"/>
+          <w:b w:val="0"/>
+          <w:i w:val="0"/>
+          <w:color w:val="000000"/>
+          <w:sz w:val="24"/>
+        </w:rPr>
+        <w:t>El módulo de evaluadores concentra rúbricas. Cada evaluador declara modelo de juez, plantilla, mapeo de variables y configuración de feedback. El formato de respuesta admite boolean, score (mínimo, máximo y descripciones de extremos) y categoría (nombre y descripción, con alta y baja de categorías). Include reasoning pide una justificación breve junto al score. Advanced reserva opciones de esquema. El investigador puede definir un juez de foro, de peligro o de evaluación sin modificar Neuronpedia.</w:t>
+      </w:r>
+    </w:p>
+    <w:p>
+      <w:pPr>
+        <w:spacing w:after="120" w:before="200" w:line="240" w:lineRule="auto"/>
+        <w:jc w:val="left"/>
+      </w:pPr>
+      <w:r>
+        <w:rPr>
+          <w:rFonts w:ascii="Times New Roman" w:hAnsi="Times New Roman" w:cs="Times New Roman" w:eastAsia="Times New Roman"/>
+          <w:b/>
+          <w:i w:val="0"/>
+          <w:color w:val="000000"/>
+          <w:sz w:val="24"/>
+        </w:rPr>
+        <w:t>5.4 Motor de corrida</w:t>
+      </w:r>
+    </w:p>
+    <w:p>
+      <w:pPr>
+        <w:spacing w:after="120" w:before="0" w:line="240" w:lineRule="auto"/>
+        <w:jc w:val="both"/>
+      </w:pPr>
+      <w:r>
+        <w:rPr>
+          <w:rFonts w:ascii="Times New Roman" w:hAnsi="Times New Roman" w:cs="Times New Roman" w:eastAsia="Times New Roman"/>
+          <w:b w:val="0"/>
+          <w:i w:val="0"/>
+          <w:color w:val="000000"/>
+          <w:sz w:val="24"/>
+        </w:rPr>
+        <w:t>El motor de corrida constituye la capa de ejecución. Elige fuente NLA, política de tokens y evaluadores, recorre el dataset, persiste cada fila y muestra el progreso. Si una explicación falla, la fila registra el error. El motor no reentrena el NLA. Encadena completion, explain y juez.</w:t>
+      </w:r>
+    </w:p>
+    <w:p>
+      <w:pPr>
+        <w:spacing w:after="120" w:before="200" w:line="240" w:lineRule="auto"/>
+        <w:jc w:val="left"/>
+      </w:pPr>
+      <w:r>
+        <w:rPr>
+          <w:rFonts w:ascii="Times New Roman" w:hAnsi="Times New Roman" w:cs="Times New Roman" w:eastAsia="Times New Roman"/>
+          <w:b/>
+          <w:i w:val="0"/>
+          <w:color w:val="000000"/>
+          <w:sz w:val="24"/>
+        </w:rPr>
+        <w:t>5.5 Tabla de filas y gráficos</w:t>
+      </w:r>
+    </w:p>
+    <w:p>
+      <w:pPr>
+        <w:spacing w:after="120" w:before="0" w:line="240" w:lineRule="auto"/>
+        <w:jc w:val="both"/>
+      </w:pPr>
+      <w:r>
+        <w:rPr>
+          <w:rFonts w:ascii="Times New Roman" w:hAnsi="Times New Roman" w:cs="Times New Roman" w:eastAsia="Times New Roman"/>
+          <w:b w:val="0"/>
+          <w:i w:val="0"/>
+          <w:color w:val="000000"/>
+          <w:sz w:val="24"/>
+        </w:rPr>
+        <w:t>Cada run se presenta como tabla. Columnas de input, referencia, output y claves de feedback, con celdas coloreadas según cumpla o no, según el score, o según la categoría. El encabezado informa el promedio de cada clave. El módulo de comparación agrupa dos o más experimentos del mismo dataset y produce gráficos de hit rate del juez y de MSE medio, de modo que se vea de inmediato si una fuente o una política cambia el señalizador interno.</w:t>
+      </w:r>
+    </w:p>
+    <w:p>
+      <w:pPr>
+        <w:spacing w:after="120" w:before="200" w:line="240" w:lineRule="auto"/>
+        <w:jc w:val="left"/>
+      </w:pPr>
+      <w:r>
+        <w:rPr>
+          <w:rFonts w:ascii="Times New Roman" w:hAnsi="Times New Roman" w:cs="Times New Roman" w:eastAsia="Times New Roman"/>
+          <w:b/>
+          <w:i w:val="0"/>
+          <w:color w:val="000000"/>
+          <w:sz w:val="24"/>
+        </w:rPr>
+        <w:t>5.6 Flujo pairwise</w:t>
+      </w:r>
+    </w:p>
+    <w:p>
+      <w:pPr>
+        <w:spacing w:after="120" w:before="0" w:line="240" w:lineRule="auto"/>
+        <w:jc w:val="both"/>
+      </w:pPr>
+      <w:r>
+        <w:rPr>
+          <w:rFonts w:ascii="Times New Roman" w:hAnsi="Times New Roman" w:cs="Times New Roman" w:eastAsia="Times New Roman"/>
+          <w:b w:val="0"/>
+          <w:i w:val="0"/>
+          <w:color w:val="000000"/>
+          <w:sz w:val="24"/>
+        </w:rPr>
+        <w:t>Una vez materializado el núcleo, cada par de AVs del mismo example accede a un juez de preferencia. La salida es preferred en 0 o 1 más razonamiento opcional. Ese flujo cubre el caso en que no basta un score absoluto y hace falta elegir entre dos verbalizaciones.</w:t>
       </w:r>
     </w:p>
     <w:p>
@@ -1615,7 +1775,7 @@
           <w:color w:val="000000"/>
           <w:sz w:val="24"/>
         </w:rPr>
-        <w:t>La validación se plantea en dos niveles, como en [4]. A nivel de señal, un conjunto fijo de prompts (familia consejo, how-to, enciclopedia, un ítem en español). Dos fuentes NLA (Llama 70B kitft-l53 y Gemma 27B kitft-l41). Una política de tokens congelada. Un juez booleano de tema de foro y un evaluador léxico. Métricas. Hit rate del juez, tasa léxica, tasa de omisión (AV sí, completion no), MSE medio. Acuerdo entre el juez y etiquetado humano sobre una muestra de AVs, en el espíritu del 97 % reportado en [1], sin copiar ese número.</w:t>
+        <w:t>La validación empírica de NLA Eval se plantea en dos niveles complementarios. A nivel de señal, se prevé un conjunto fijo de prompts (familia consejo, how-to, enciclopedia, un ítem en español), dos fuentes NLA (Llama 70B kitft-l53 y Gemma 27B kitft-l41), una política de tokens congelada, un juez booleano de tema de foro y un evaluador léxico. Las métricas de interés incluyen hit rate del juez, tasa léxica, tasa de omisión (AV sí, completion no), MSE medio, y el grado de coincidencia entre el juez y etiquetado humano sobre una muestra de AVs, en el espíritu del acuerdo reportado en [1], sin copiar ese número.</w:t>
       </w:r>
     </w:p>
     <w:p>
@@ -1631,7 +1791,7 @@
           <w:color w:val="000000"/>
           <w:sz w:val="24"/>
         </w:rPr>
-        <w:t>A nivel de herramienta. Tiempo para reproducir una comparación que hoy exige pestañas. Capacidad de un tercero de definir un juez distinto (por ejemplo peligro o evaluación) sin tocar Neuronpedia. Usabilidad del laboratorio. Los resultados de esa validación son el trabajo que este artículo deja explícitamente abierto, no un resultado adelantado.</w:t>
+        <w:t>A nivel de plataforma, se diseñará un protocolo con investigadores que permita medir el tiempo para reproducir una comparación que hoy exige pestañas, la capacidad de un tercero de definir un juez distinto sin tocar Neuronpedia, y la confianza en las celdas de feedback. Los resultados permitirán ajustar rúbricas, política de tokens y parámetros del orquestador.</w:t>
       </w:r>
     </w:p>
     <w:p>
@@ -1663,7 +1823,7 @@
           <w:color w:val="000000"/>
           <w:sz w:val="24"/>
         </w:rPr>
-        <w:t>El marco hereda los límites del instrumento. El NLA se entrena en una capa fija. El AV es un señalizador. El juez puede sesgarse hacia lexemas o hacia el propio prompt. Neuronpedia impone cupos. El prototipo no cubre pairwise ni jueces de código más allá del léxico. No hay NLA públicos sobre modelos base, así que no se replica el eje base frente a SFT de otros papers de sesgo cultural [5]. Nada de esto autoriza a leer un AV como pensamiento.</w:t>
+        <w:t>El marco hereda los límites del instrumento. El NLA se entrena en una capa fija. El AV es un señalizador. El juez puede sesgarse hacia lexemas o hacia el propio prompt. Neuronpedia impone cupos. El pairwise y los jueces de código más allá del léxico quedan como extensión del núcleo. No hay NLA públicos sobre modelos base, así que no se replica el eje base frente a SFT de otros estudios de sesgo cultural [5]. Nada de esto autoriza a leer un AV como pensamiento.</w:t>
       </w:r>
     </w:p>
     <w:p>
@@ -1695,7 +1855,7 @@
           <w:color w:val="000000"/>
           <w:sz w:val="24"/>
         </w:rPr>
-        <w:t>Se presentó un marco para evaluar verbalizaciones NLA con el mismo ciclo que LangSmith ofrece para salidas de aplicaciones con IA. El aporte no es un método nuevo de interpretabilidad. Es convertir la inspección puntual de Neuronpedia y el grader ocasional de Anthropic en un laboratorio con dataset, política de tokens, evaluadores y comparación de corridas. El prototipo muestra que la implementación es un orquestador sobre APIs existentes. La validación empírica, el acuerdo humano-juez y el evaluador pairwise son los pasos siguientes.</w:t>
+        <w:t>Este trabajo presentó NLA Eval, una plataforma para la evaluación de verbalizaciones NLA que operacionaliza datasets, política de tokens, evaluadores y comparación de corridas mediante un orquestador sobre la API de Neuronpedia. El aporte no es un método nuevo de interpretabilidad. Es convertir la inspección puntual y el grader ocasional de un paper en un laboratorio reutilizable.</w:t>
       </w:r>
     </w:p>
     <w:p>
@@ -1711,7 +1871,39 @@
           <w:color w:val="000000"/>
           <w:sz w:val="24"/>
         </w:rPr>
-        <w:t>Neuronpedia fomentó el acceso a NLA. NLA Eval apunta a fomentar investigaciones que los usen, con una forma determinística de probar hipótesis sobre temas en AVs.</w:t>
+        <w:t>Entre los trabajos futuros se destacan la ejecución del protocolo de la Sección 6, la implementación plena del flujo pairwise y la persistencia compartida en despliegue. Neuronpedia fomentó el acceso a NLA. NLA Eval apunta a fomentar investigaciones que los usen.</w:t>
+      </w:r>
+    </w:p>
+    <w:p>
+      <w:pPr>
+        <w:spacing w:after="120" w:before="200" w:line="240" w:lineRule="auto"/>
+        <w:jc w:val="left"/>
+      </w:pPr>
+      <w:r>
+        <w:rPr>
+          <w:rFonts w:ascii="Times New Roman" w:hAnsi="Times New Roman" w:cs="Times New Roman" w:eastAsia="Times New Roman"/>
+          <w:b/>
+          <w:i w:val="0"/>
+          <w:color w:val="000000"/>
+          <w:sz w:val="24"/>
+        </w:rPr>
+        <w:t>9. Referencias de diseño</w:t>
+      </w:r>
+    </w:p>
+    <w:p>
+      <w:pPr>
+        <w:spacing w:after="120" w:before="0" w:line="240" w:lineRule="auto"/>
+        <w:jc w:val="both"/>
+      </w:pPr>
+      <w:r>
+        <w:rPr>
+          <w:rFonts w:ascii="Times New Roman" w:hAnsi="Times New Roman" w:cs="Times New Roman" w:eastAsia="Times New Roman"/>
+          <w:b w:val="0"/>
+          <w:i w:val="0"/>
+          <w:color w:val="000000"/>
+          <w:sz w:val="24"/>
+        </w:rPr>
+        <w:t>El recorte de funcionalidades de NLA Eval no parte de una lista ad hoc. Se tomó como referencia la manera de trabajar de un framework altamente popular en la evaluación de aplicaciones basadas en LLM, organizado en datasets, experimentos, evaluadores con claves de feedback y vistas de comparación entre corridas [3]. Ese modo de trabajo, pensado para salidas de aplicaciones no deterministas, sirvió para diseñar los módulos de la plataforma. Dataset, rúbrica, corrida, tabla de filas y gráficos. El objeto evaluado cambia. No es la respuesta pública del modelo, sino el AV en una posición de token, con MSE y, cuando corresponde, omisión frente a la completion. La referencia es de método de laboratorio, no de identidad de producto.</w:t>
       </w:r>
     </w:p>
     <w:p>

</xml_diff>

<commit_message>
Lead the abstract with NLA lab need vs Neuronpedia and LangSmith.
</commit_message>
<xml_diff>
--- a/research/conaiisi_2026_nla_eval.docx
+++ b/research/conaiisi_2026_nla_eval.docx
@@ -121,7 +121,7 @@
           <w:color w:val="000000"/>
           <w:sz w:val="20"/>
         </w:rPr>
-        <w:t>Este trabajo presenta NLA Eval, una plataforma orientada a la evaluación sistemática de verbalizaciones de activación producidas por Natural Language Autoencoders (NLA). Un NLA comprime el vector de activación de un modelo de lenguaje en un texto breve y reconstruye ese vector a partir del texto. Ese texto, llamado Activation Verbalizer (AV), es un señalizador interpretable, no una lectura literal de las creencias del modelo. Neuronpedia permite inspeccionar un chat y un token a la vez, pero no cubre el ciclo completo de experimento sobre NLA públicos. Anthropic aplica un LLM como juez sobre AVs en un estudio de awareness de evaluación, como método interno de un paper, no como herramienta reutilizable. NLA Eval operacionaliza ese ciclo mediante datasets de prompts, una política de tokens, llamadas a la API de Neuronpedia, evaluadores configurables y una vista de comparación de corridas. El objeto evaluado es el AV en una posición de token, no la respuesta pública del modelo. La validación empírica en contextos de investigación y el acuerdo humano-juez sobre un corpus etiquetado constituyen los pasos siguientes para consolidar su impacto.</w:t>
+        <w:t>La motivación de este trabajo es una necesidad identificada en nuestras propias rondas de experimentación con Natural Language Autoencoders (NLA) sobre las herramientas disponibles. Neuronpedia permite inspeccionar un chat y un token a la vez, pero no cubre el ciclo de evaluación de un experimento. Ese vacío contrasta con las aplicaciones basadas en LLM, donde frameworks como LangSmith son estándar para datasets, evaluadores y comparación de corridas. Un NLA comprime el vector de activación de un modelo de lenguaje en un texto breve y reconstruye ese vector a partir del texto. Ese texto, llamado Activation Verbalizer (AV), es un señalizador interpretable, no una lectura literal de las creencias del modelo. Anthropic aplica un LLM como juez sobre AVs como método interno de un paper, no como herramienta reutilizable. El presente trabajo presenta NLA Eval, una plataforma que operacionaliza el ciclo de experimento sobre NLA públicos mediante datasets de prompts, una política de tokens, llamadas a la API de Neuronpedia, evaluadores configurables y una vista de comparación de corridas. El objeto evaluado es el AV en una posición de token, no la respuesta pública del modelo. La validación empírica en contextos de investigación y el acuerdo humano-juez sobre un corpus etiquetado constituyen los pasos siguientes para consolidar su impacto.</w:t>
       </w:r>
     </w:p>
     <w:p>
@@ -153,7 +153,7 @@
           <w:color w:val="000000"/>
           <w:sz w:val="20"/>
         </w:rPr>
-        <w:t>Natural Language Autoencoders, interpretabilidad, LLM-as-judge, Neuronpedia, evaluación de modelos de lenguaje</w:t>
+        <w:t>Natural Language Autoencoders, interpretabilidad, LLM-as-judge, Neuronpedia, LangSmith, evaluación de modelos de lenguaje</w:t>
       </w:r>
     </w:p>
     <w:p>

</xml_diff>